<commit_message>
docs: add VID organisational prerequisites to PPTX, MD and DOCX
- PowerPoint: new slide 3 "Voraussetzungen für VID-Erfolg" — 3×2 card
  grid covering Standardisierung, Vollautomatisierung, Schichtentrennung,
  Zentrales Repository, Klare Governance, Pilot vor Rollout
- Architekturkonzept MD: new section 1.4 with the same six prerequisites
- Architekturkonzept DOCX (v1.2): new section 1.4 inserted before
  "2 Das 8-Schichten-Modell"

Co-Authored-By: Claude Sonnet 4.6 <noreply@anthropic.com>
</commit_message>
<xml_diff>
--- a/VID-Architekturkonzept-v1.2.docx
+++ b/VID-Architekturkonzept-v1.2.docx
@@ -947,6 +947,124 @@
       <w:r>
         <w:rPr/>
         <w:t>EntraID-only Szenarien (vorgesehen für Phase 3)</w:t>
+      </w:r>
+    </w:p>
+    <w:p>
+      <w:pPr>
+        <w:pStyle w:val="Heading2"/>
+        <w:rPr/>
+      </w:pPr>
+      <w:bookmarkStart w:id="900" w:name="organisatorische-voraussetzungen"/>
+      <w:r>
+        <w:rPr/>
+        <w:t>1.4 Organisatorische Voraussetzungen für VID-Erfolg</w:t>
+      </w:r>
+      <w:bookmarkEnd w:id="900"/>
+    </w:p>
+    <w:p>
+      <w:pPr>
+        <w:pStyle w:val="FirstParagraph"/>
+        <w:rPr/>
+      </w:pPr>
+      <w:r>
+        <w:rPr/>
+        <w:t>VID ist kein reines Technologieprojekt. Der Erfolg des Programms setzt organisatorische Rahmenbedingungen voraus, die vor dem ersten Build erfüllt sein müssen. Technik allein genügt nicht — Standards müssen gelebt, nicht nur beschlossen werden.</w:t>
+      </w:r>
+    </w:p>
+    <w:p>
+      <w:pPr>
+        <w:pStyle w:val="BodyText"/>
+        <w:rPr/>
+      </w:pPr>
+      <w:r>
+        <w:rPr>
+          <w:b/>
+        </w:rPr>
+        <w:t xml:space="preserve">Standardisierung: </w:t>
+      </w:r>
+      <w:r>
+        <w:rPr/>
+        <w:t>Einheitliche OS-Images ohne Ausnahmen. Keine abteilungsspezifischen Sonderpakete auf Layer-5-Ebene. Abweichungen werden ausschließlich in höheren Schichten (L7+) abgebildet.</w:t>
+      </w:r>
+    </w:p>
+    <w:p>
+      <w:pPr>
+        <w:pStyle w:val="BodyText"/>
+        <w:rPr/>
+      </w:pPr>
+      <w:r>
+        <w:rPr>
+          <w:b/>
+        </w:rPr>
+        <w:t xml:space="preserve">Vollautomatisierung: </w:t>
+      </w:r>
+      <w:r>
+        <w:rPr/>
+        <w:t>Kein manuelles Golding. Jede Änderung am Image läuft durch die Packer-Pipeline — reproduzierbar, versioniert und auditierbar. Manuelle Eingriffe in das Master-Image sind nicht erlaubt.</w:t>
+      </w:r>
+    </w:p>
+    <w:p>
+      <w:pPr>
+        <w:pStyle w:val="BodyText"/>
+        <w:rPr/>
+      </w:pPr>
+      <w:r>
+        <w:rPr>
+          <w:b/>
+        </w:rPr>
+        <w:t xml:space="preserve">Strikte Schichtentrennung: </w:t>
+      </w:r>
+      <w:r>
+        <w:rPr/>
+        <w:t>OS (L5), Treiber (L6) und Broker-Komponenten (L7) werden nie auf derselben Ebene gemischt. Ziel ist es, einzelne Layer updaten zu können, ohne einen vollständigen OS-Rebuild auszulösen.</w:t>
+      </w:r>
+    </w:p>
+    <w:p>
+      <w:pPr>
+        <w:pStyle w:val="BodyText"/>
+        <w:rPr/>
+      </w:pPr>
+      <w:r>
+        <w:rPr>
+          <w:b/>
+        </w:rPr>
+        <w:t xml:space="preserve">Zentrales Repository: </w:t>
+      </w:r>
+      <w:r>
+        <w:rPr/>
+        <w:t>Alle Installer, Konfigurationsdateien und Tools liegen zentral im VID-Data-Share. Kein lokales Caching auf Build-Maschinen — der Share ist die einzige zuverlässige Quelle (Single Source of Truth).</w:t>
+      </w:r>
+    </w:p>
+    <w:p>
+      <w:pPr>
+        <w:pStyle w:val="BodyText"/>
+        <w:rPr/>
+      </w:pPr>
+      <w:r>
+        <w:rPr>
+          <w:b/>
+        </w:rPr>
+        <w:t xml:space="preserve">Klare Governance: </w:t>
+      </w:r>
+      <w:r>
+        <w:rPr/>
+        <w:t>Für jeden Layer ist ein verantwortlicher Owner definiert. Änderungen am Image sind nur durch einen dokumentierten, nachvollziehbaren Prozess erlaubt. Ad-hoc-Patching und direkte VM-Modifikationen sind ausgeschlossen.</w:t>
+      </w:r>
+    </w:p>
+    <w:p>
+      <w:pPr>
+        <w:pStyle w:val="BodyText"/>
+        <w:rPr/>
+      </w:pPr>
+      <w:r>
+        <w:rPr>
+          <w:b/>
+        </w:rPr>
+        <w:t xml:space="preserve">Pilot vor Rollout: </w:t>
+      </w:r>
+      <w:r>
+        <w:rPr/>
+        <w:t>Jedes neue Image wird zuerst in einer dedizierten Pilot-Gruppe validiert, bevor es auf die Gesamtflotte ausgerollt wird. Eine Rückfalloption via vSphere-Snapshot des vorherigen Master-Images muss zum Zeitpunkt des Rollouts stets verfügbar sein.</w:t>
       </w:r>
     </w:p>
     <w:p>

</xml_diff>

<commit_message>
docs: review and update all VID documents
PPTX slide 7 status updated (build done), slide 9 nächste Schritte
updated, slide 6 MCS-Prep note vid_broker/pagefile. MD and DOCX:
D: disk init step added, Schicht labels 5->7 fixed for VDA/optimize/
mcs-prep, MCS Prep description updated (Pagefile auf D:, kein NIC-Reset).

Co-Authored-By: Claude Sonnet 4.6 <noreply@anthropic.com>
</commit_message>
<xml_diff>
--- a/VID-Architekturkonzept-v1.2.docx
+++ b/VID-Architekturkonzept-v1.2.docx
@@ -5025,7 +5025,7 @@
       </w:r>
       <w:r>
         <w:rPr/>
-        <w:t xml:space="preserve"> windows-citrix-mcs-prep.ps1: Temp-Cleanup, DISM, kein Sysprep. VMs erhalten Identität (SID, Hostname) durch MCS.</w:t>
+        <w:t xml:space="preserve"> windows-citrix-mcs-prep.ps1: Temp-Cleanup, DISM, Eventlog-Clear, kein Sysprep. Pagefile wird auf D:\ (Write-Cache-Disk) gelegt wenn vid_broker = “citrix-mcs”. Kein NIC-Reset (MCS weist neue MAC/IP pro VM automatisch zu). VMs erhalten Identität (SID, Hostname, Domain-Join) durch MCS beim ersten Start.</w:t>
       </w:r>
     </w:p>
     <w:p>
@@ -6027,7 +6027,7 @@
       </w:r>
       <w:r>
         <w:rPr/>
-        <w:t xml:space="preserve"> windows-citrix-mcs-prep.ps1 (kein Sysprep! Temp-Cleanup, DISM)</w:t>
+        <w:t xml:space="preserve"> windows-citrix-mcs-prep.ps1 (kein Sysprep, Pagefile auf D:, kein NIC-Reset)</w:t>
       </w:r>
     </w:p>
     <w:p>
@@ -13671,38 +13671,38 @@
                 <w:szCs w:val="24"/>
                 <w:lang w:val="de-DE" w:eastAsia="en-US" w:bidi="ar-SA"/>
               </w:rPr>
-              <w:t>5</w:t>
-            </w:r>
-          </w:p>
-        </w:tc>
-        <w:tc>
-          <w:tcPr>
-            <w:tcW w:w="3120" w:type="dxa"/>
-            <w:tcBorders/>
-          </w:tcPr>
-          <w:p>
-            <w:pPr>
-              <w:pStyle w:val="Compact"/>
-              <w:widowControl/>
-              <w:spacing w:before="36" w:after="36"/>
-              <w:jc w:val="left"/>
-              <w:rPr>
-                <w:rFonts w:ascii="Cambria" w:hAnsi="Cambria" w:eastAsia="Cambria" w:cs=""/>
-                <w:kern w:val="0"/>
-                <w:sz w:val="24"/>
-                <w:szCs w:val="24"/>
-                <w:lang w:val="de-DE" w:eastAsia="en-US" w:bidi="ar-SA"/>
-              </w:rPr>
-            </w:pPr>
-            <w:r>
-              <w:rPr>
-                <w:rFonts w:eastAsia="Cambria" w:cs=""/>
-                <w:kern w:val="0"/>
-                <w:sz w:val="24"/>
-                <w:szCs w:val="24"/>
-                <w:lang w:val="de-DE" w:eastAsia="en-US" w:bidi="ar-SA"/>
-              </w:rPr>
-              <w:t>Citrix VDA silent install (/mastermcsimage)</w:t>
+              <w:t>7</w:t>
+            </w:r>
+          </w:p>
+        </w:tc>
+        <w:tc>
+          <w:tcPr>
+            <w:tcW w:w="3120" w:type="dxa"/>
+            <w:tcBorders/>
+          </w:tcPr>
+          <w:p>
+            <w:pPr>
+              <w:pStyle w:val="Compact"/>
+              <w:widowControl/>
+              <w:spacing w:before="36" w:after="36"/>
+              <w:jc w:val="left"/>
+              <w:rPr>
+                <w:rFonts w:ascii="Cambria" w:hAnsi="Cambria" w:eastAsia="Cambria" w:cs=""/>
+                <w:kern w:val="0"/>
+                <w:sz w:val="24"/>
+                <w:szCs w:val="24"/>
+                <w:lang w:val="de-DE" w:eastAsia="en-US" w:bidi="ar-SA"/>
+              </w:rPr>
+            </w:pPr>
+            <w:r>
+              <w:rPr>
+                <w:rFonts w:eastAsia="Cambria" w:cs=""/>
+                <w:kern w:val="0"/>
+                <w:sz w:val="24"/>
+                <w:szCs w:val="24"/>
+                <w:lang w:val="de-DE" w:eastAsia="en-US" w:bidi="ar-SA"/>
+              </w:rPr>
+              <w:t>Citrix VDA silent install (/mastermcsimage); vid_broker-aware</w:t>
             </w:r>
           </w:p>
         </w:tc>
@@ -13767,7 +13767,7 @@
                 <w:szCs w:val="24"/>
                 <w:lang w:val="de-DE" w:eastAsia="en-US" w:bidi="ar-SA"/>
               </w:rPr>
-              <w:t>5</w:t>
+              <w:t>7</w:t>
             </w:r>
           </w:p>
         </w:tc>
@@ -13863,38 +13863,38 @@
                 <w:szCs w:val="24"/>
                 <w:lang w:val="de-DE" w:eastAsia="en-US" w:bidi="ar-SA"/>
               </w:rPr>
-              <w:t>5</w:t>
-            </w:r>
-          </w:p>
-        </w:tc>
-        <w:tc>
-          <w:tcPr>
-            <w:tcW w:w="3120" w:type="dxa"/>
-            <w:tcBorders/>
-          </w:tcPr>
-          <w:p>
-            <w:pPr>
-              <w:pStyle w:val="Compact"/>
-              <w:widowControl/>
-              <w:spacing w:before="36" w:after="36"/>
-              <w:jc w:val="left"/>
-              <w:rPr>
-                <w:rFonts w:ascii="Cambria" w:hAnsi="Cambria" w:eastAsia="Cambria" w:cs=""/>
-                <w:kern w:val="0"/>
-                <w:sz w:val="24"/>
-                <w:szCs w:val="24"/>
-                <w:lang w:val="de-DE" w:eastAsia="en-US" w:bidi="ar-SA"/>
-              </w:rPr>
-            </w:pPr>
-            <w:r>
-              <w:rPr>
-                <w:rFonts w:eastAsia="Cambria" w:cs=""/>
-                <w:kern w:val="0"/>
-                <w:sz w:val="24"/>
-                <w:szCs w:val="24"/>
-                <w:lang w:val="de-DE" w:eastAsia="en-US" w:bidi="ar-SA"/>
-              </w:rPr>
-              <w:t>MCS-Vorbereitung (kein Sysprep, Cleanup, DISM)</w:t>
+              <w:t>7</w:t>
+            </w:r>
+          </w:p>
+        </w:tc>
+        <w:tc>
+          <w:tcPr>
+            <w:tcW w:w="3120" w:type="dxa"/>
+            <w:tcBorders/>
+          </w:tcPr>
+          <w:p>
+            <w:pPr>
+              <w:pStyle w:val="Compact"/>
+              <w:widowControl/>
+              <w:spacing w:before="36" w:after="36"/>
+              <w:jc w:val="left"/>
+              <w:rPr>
+                <w:rFonts w:ascii="Cambria" w:hAnsi="Cambria" w:eastAsia="Cambria" w:cs=""/>
+                <w:kern w:val="0"/>
+                <w:sz w:val="24"/>
+                <w:szCs w:val="24"/>
+                <w:lang w:val="de-DE" w:eastAsia="en-US" w:bidi="ar-SA"/>
+              </w:rPr>
+            </w:pPr>
+            <w:r>
+              <w:rPr>
+                <w:rFonts w:eastAsia="Cambria" w:cs=""/>
+                <w:kern w:val="0"/>
+                <w:sz w:val="24"/>
+                <w:szCs w:val="24"/>
+                <w:lang w:val="de-DE" w:eastAsia="en-US" w:bidi="ar-SA"/>
+              </w:rPr>
+              <w:t>MCS-Vorbereitung: Cleanup, DISM, Pagefile auf D:, kein Sysprep, kein NIC-Reset</w:t>
             </w:r>
           </w:p>
         </w:tc>

</xml_diff>

<commit_message>
docs: Schichten-Terminologie, Arial-Font, xoap.io und Login Enterprise ergaenzt
- L5/L6/L7 -> Schicht 5/6/7 in allen Dokumenten (Schichtentrennung-Abschnitt)
- Schriftart Arial in PPTX (Theme) und DOCX (Styles)
- xoap.io als alternative Image-Automation-Plattform (Kap. 14 / Slide 4)
- Login Enterprise (Login VSI) in DEX-Schicht 8 ergaenzt (Kap. 8.4a / Slide 3+7)

Co-Authored-By: Claude Sonnet 4.6 <noreply@anthropic.com>
</commit_message>
<xml_diff>
--- a/VID-Architekturkonzept-v1.2.docx
+++ b/VID-Architekturkonzept-v1.2.docx
@@ -748,7 +748,7 @@
       </w:r>
       <w:r>
         <w:rPr/>
-        <w:t xml:space="preserve"> Packer, Terraform und PowerShell beschreiben die gesamte Umgebung deklarativ.</w:t>
+        <w:t xml:space="preserve"> Packer, Terraform und PowerShell beschreiben die gesamte Umgebung deklarativ. Als alternative Image-Automation-Plattform wird xoap (xoap.io) evaluiert — xoap kapselt Packer-Templates und ermöglicht Multi-Platform-Builds (VMware, Azure, AWS, Nutanix) ohne tiefes Packer-Expertise.</w:t>
       </w:r>
     </w:p>
     <w:p>
@@ -984,7 +984,7 @@
       </w:r>
       <w:r>
         <w:rPr/>
-        <w:t>Einheitliche OS-Images ohne Ausnahmen. Keine abteilungsspezifischen Sonderpakete auf Layer-5-Ebene. Abweichungen werden ausschließlich in höheren Schichten (L7+) abgebildet.</w:t>
+        <w:t>Einheitliche OS-Images ohne Ausnahmen. Keine abteilungsspezifischen Sonderpakete auf Schicht-5-Ebene. Abweichungen werden ausschließlich in höheren Schichten (Schicht 7+) abgebildet.</w:t>
       </w:r>
     </w:p>
     <w:p>
@@ -1016,7 +1016,7 @@
       </w:r>
       <w:r>
         <w:rPr/>
-        <w:t>OS (L5), Treiber (L6) und Broker-Komponenten (L7) werden nie auf derselben Ebene gemischt. Ziel ist es, einzelne Layer updaten zu können, ohne einen vollständigen OS-Rebuild auszulösen.</w:t>
+        <w:t>OS (Schicht 5), Treiber (Schicht 6) und Broker-Komponenten (Schicht 7) werden nie in denselben Scripts oder Konfigurationen vermischt. Packer baut zwar immer die gesamte Pipeline durch — der Wert der Trennung liegt jedoch darin, dass eine Änderung in einer Schicht (z.B. Broker-Wechsel Schicht 7: Citrix VDA → AVD Agent) keine Anpassung der anderen Schicht-Scripts erfordert. Jede Schicht hat exakt eine Verantwortung und einen klaren Owner.</w:t>
       </w:r>
     </w:p>
     <w:p>
@@ -1048,7 +1048,7 @@
       </w:r>
       <w:r>
         <w:rPr/>
-        <w:t>Für jeden Layer ist ein verantwortlicher Owner definiert. Änderungen am Image sind nur durch einen dokumentierten, nachvollziehbaren Prozess erlaubt. Ad-hoc-Patching und direkte VM-Modifikationen sind ausgeschlossen.</w:t>
+        <w:t>Für jede Schicht ist ein verantwortlicher Owner definiert. Änderungen am Image sind nur durch einen dokumentierten, nachvollziehbaren Prozess erlaubt. Ad-hoc-Patching und direkte VM-Modifikationen sind ausgeschlossen.</w:t>
       </w:r>
     </w:p>
     <w:p>
@@ -10519,6 +10519,104 @@
       <w:r>
         <w:rPr/>
         <w:t xml:space="preserve"> Beide Tools schließen sich nicht aus. ControlUp für operatives Echtzeit-Monitoring und proaktive Remediation, uberagent für historische Trendanalyse und Security-Visibility. Im VID-Kontext werden beide als Layer-8-Agenten im Image installiert und können unabhängig voneinander aktiviert, deaktiviert oder ersetzt werden.</w:t>
+      </w:r>
+    </w:p>
+    <w:p>
+      <w:pPr>
+        <w:pStyle w:val="Heading2"/>
+      </w:pPr>
+      <w:r>
+        <w:t>8.4a Login Enterprise (Login VSI) — Image-Validierung gegen Baseline</w:t>
+      </w:r>
+    </w:p>
+    <w:p>
+      <w:pPr>
+        <w:pStyle w:val="BodyText"/>
+      </w:pPr>
+      <w:r>
+        <w:rPr>
+          <w:b/>
+        </w:rPr>
+        <w:t xml:space="preserve">Login Enterprise </w:t>
+      </w:r>
+      <w:r>
+        <w:t xml:space="preserve">(loginvsi.com) ist eine automatisierte Test- und Validierungsplattform für VDI- und DaaS-Umgebungen. Im VID-Kontext dient Login Enterprise nicht als dauerhafter Monitoring-Agent im Image, sondern als Qualitätssicherungswerkzeug: Jedes neue Packer-Image wird nach dem Build gegen eine definierte Baseline getestet, bevor es in die Produktion ausgerollt wird.</w:t>
+      </w:r>
+    </w:p>
+    <w:p>
+      <w:pPr>
+        <w:pStyle w:val="BodyText"/>
+      </w:pPr>
+      <w:r>
+        <w:t>Kernfunktion im VID-Workflow:</w:t>
+      </w:r>
+    </w:p>
+    <w:p>
+      <w:pPr>
+        <w:pStyle w:val="Normal"/>
+        <w:numPr>
+          <w:ilvl w:val="0"/>
+          <w:numId w:val="2"/>
+        </w:numPr>
+      </w:pPr>
+      <w:r>
+        <w:rPr>
+          <w:b/>
+        </w:rPr>
+        <w:t xml:space="preserve">Baseline-EUX-Score: </w:t>
+      </w:r>
+      <w:r>
+        <w:t>Nach jedem erfolgreichen Build wird ein automatisierter Lasttest durchgeführt. Der gemessene EUX-Score wird als Baseline gespeichert.</w:t>
+      </w:r>
+    </w:p>
+    <w:p>
+      <w:pPr>
+        <w:pStyle w:val="Normal"/>
+        <w:numPr>
+          <w:ilvl w:val="0"/>
+          <w:numId w:val="2"/>
+        </w:numPr>
+      </w:pPr>
+      <w:r>
+        <w:rPr>
+          <w:b/>
+        </w:rPr>
+        <w:t xml:space="preserve">Regressionstest: </w:t>
+      </w:r>
+      <w:r>
+        <w:t>Bei Änderungen an Schicht 5, 6 oder 7 wird das neue Image automatisch gegen die Baseline getestet. Eine signifikante Verschlechterung des EUX-Scores blockiert den Rollout.</w:t>
+      </w:r>
+    </w:p>
+    <w:p>
+      <w:pPr>
+        <w:pStyle w:val="Normal"/>
+        <w:numPr>
+          <w:ilvl w:val="0"/>
+          <w:numId w:val="2"/>
+        </w:numPr>
+      </w:pPr>
+      <w:r>
+        <w:rPr>
+          <w:b/>
+        </w:rPr>
+        <w:t xml:space="preserve">VSImax: </w:t>
+      </w:r>
+      <w:r>
+        <w:t>Maximale Anzahl gleichzeitiger VDI-Sessions ohne spürbare Performance-Degradation — wichtiger Kapazitätsplanungsparameter.</w:t>
+      </w:r>
+    </w:p>
+    <w:p>
+      <w:pPr>
+        <w:pStyle w:val="BodyText"/>
+      </w:pPr>
+      <w:r>
+        <w:rPr>
+          <w:b/>
+        </w:rPr>
+        <w:t xml:space="preserve">VID-Prinzip: </w:t>
+      </w:r>
+      <w:r>
+        <w:t>Login Enterprise ist vollständig unabhängig von den VID-Schichten. Es greift von außen auf die bereitgestellten VMs zu — kein Agent im Master Image erforderlich.</w:t>
       </w:r>
     </w:p>
     <w:p>
@@ -27298,6 +27396,148 @@
       <w:r>
         <w:rPr/>
         <w:t xml:space="preserve"> Merksatz für alle Implementierungsentscheidungen: 'Ist es ein Treiber? → Schicht 6. Ist es ein Broker- oder Profil-Agent? → Schicht 7. Ist es eine Umgebungs-Konfiguration mit Pfaden, IPs oder Servernamen? → Schicht 4 (GPO). Ist es das Betriebssystem selbst? → Schicht 5.'</w:t>
+      </w:r>
+    </w:p>
+    <w:p>
+      <w:pPr>
+        <w:pStyle w:val="Heading1"/>
+      </w:pPr>
+      <w:r>
+        <w:t>14 Alternative Image-Automation: xoap</w:t>
+      </w:r>
+    </w:p>
+    <w:p>
+      <w:pPr>
+        <w:pStyle w:val="Heading2"/>
+      </w:pPr>
+      <w:r>
+        <w:t>14.1 Überblick xoap</w:t>
+      </w:r>
+    </w:p>
+    <w:p>
+      <w:pPr>
+        <w:pStyle w:val="BodyText"/>
+      </w:pPr>
+      <w:r>
+        <w:rPr>
+          <w:b/>
+        </w:rPr>
+        <w:t xml:space="preserve">xoap </w:t>
+      </w:r>
+      <w:r>
+        <w:t xml:space="preserve">(xoap.io) ist eine kommerzielle Image-Automation-Plattform, die als Alternative oder Ergänzung zur aktuellen Packer-basierten Pipeline evaluiert wird. xoap kapselt Packer-Templates und bietet eine GUI-gestützte Verwaltung von Golden-Image-Pipelines — ohne tiefes Packer- oder Ansible-Know-how.</w:t>
+      </w:r>
+    </w:p>
+    <w:p>
+      <w:pPr>
+        <w:pStyle w:val="BodyText"/>
+      </w:pPr>
+      <w:r>
+        <w:t>Kernfunktionen:</w:t>
+      </w:r>
+    </w:p>
+    <w:p>
+      <w:pPr>
+        <w:pStyle w:val="Normal"/>
+        <w:numPr>
+          <w:ilvl w:val="0"/>
+          <w:numId w:val="2"/>
+        </w:numPr>
+      </w:pPr>
+      <w:r>
+        <w:rPr>
+          <w:b/>
+        </w:rPr>
+        <w:t xml:space="preserve">Multi-Platform-Builds: </w:t>
+      </w:r>
+      <w:r>
+        <w:t>VMware vSphere, Microsoft Azure, AWS, Nutanix, GCP — ein Image, viele Zielsysteme</w:t>
+      </w:r>
+    </w:p>
+    <w:p>
+      <w:pPr>
+        <w:pStyle w:val="Normal"/>
+        <w:numPr>
+          <w:ilvl w:val="0"/>
+          <w:numId w:val="2"/>
+        </w:numPr>
+      </w:pPr>
+      <w:r>
+        <w:rPr>
+          <w:b/>
+        </w:rPr>
+        <w:t xml:space="preserve">Open-Source-Templates: </w:t>
+      </w:r>
+      <w:r>
+        <w:t>xoap pflegt öffentliche Packer-Templates für Windows 11 / Windows Server auf GitHub (xoap-io/xoap-image-management-templates)</w:t>
+      </w:r>
+    </w:p>
+    <w:p>
+      <w:pPr>
+        <w:pStyle w:val="Normal"/>
+        <w:numPr>
+          <w:ilvl w:val="0"/>
+          <w:numId w:val="2"/>
+        </w:numPr>
+      </w:pPr>
+      <w:r>
+        <w:rPr>
+          <w:b/>
+        </w:rPr>
+        <w:t xml:space="preserve">Software-Integration: </w:t>
+      </w:r>
+      <w:r>
+        <w:t>PowerShell PSADT, Winget, Chocolatey, PowerShell DSC, Ansible Playbooks — identischer Ansatz zu VID Phase 1</w:t>
+      </w:r>
+    </w:p>
+    <w:p>
+      <w:pPr>
+        <w:pStyle w:val="Normal"/>
+        <w:numPr>
+          <w:ilvl w:val="0"/>
+          <w:numId w:val="2"/>
+        </w:numPr>
+      </w:pPr>
+      <w:r>
+        <w:rPr>
+          <w:b/>
+        </w:rPr>
+        <w:t xml:space="preserve">Versionierung &amp; Audit: </w:t>
+      </w:r>
+      <w:r>
+        <w:t>Zentrales Repository, reproduzierbare Builds, auditierbare Änderungshistorie</w:t>
+      </w:r>
+    </w:p>
+    <w:p>
+      <w:pPr>
+        <w:pStyle w:val="Heading2"/>
+      </w:pPr>
+      <w:r>
+        <w:t>14.2 Bewertung im VID-Kontext</w:t>
+      </w:r>
+    </w:p>
+    <w:p>
+      <w:pPr>
+        <w:pStyle w:val="BodyText"/>
+      </w:pPr>
+      <w:r>
+        <w:t>xoap und der bestehende Packer-Ansatz sind konzeptionell kompatibel. Beide unterstützen die VID-Schichtentrennung und vollautomatisierte Builds. xoap reduziert die Einstiegshürde erheblich — die PowerShell-Scripts (Schicht 5–7) können 1:1 übernommen werden.</w:t>
+      </w:r>
+    </w:p>
+    <w:p>
+      <w:pPr>
+        <w:pStyle w:val="Heading2"/>
+      </w:pPr>
+      <w:r>
+        <w:t>14.3 Migrationspfad</w:t>
+      </w:r>
+    </w:p>
+    <w:p>
+      <w:pPr>
+        <w:pStyle w:val="BodyText"/>
+      </w:pPr>
+      <w:r>
+        <w:t>Ein Wechsel zu xoap erfordert keine Änderung an den VID-Schichten oder den PowerShell-Scripts. xoap nutzt dieselbe Script-Logik (Schicht 5–7) — nur der Build-Orchestrator ändert sich. Die VID-Kernprinzipien (Schichtentrennung, Vollautomatisierung, IaC) bleiben vollständig erhalten.</w:t>
       </w:r>
     </w:p>
     <w:sectPr>
@@ -31356,7 +31596,7 @@
   <w:docDefaults>
     <w:rPrDefault>
       <w:rPr>
-        <w:rFonts w:ascii="Cambria" w:hAnsi="Cambria" w:eastAsia="Cambria" w:cs="" w:asciiTheme="minorHAnsi" w:cstheme="minorBidi" w:eastAsiaTheme="minorHAnsi" w:hAnsiTheme="minorHAnsi"/>
+        <w:rFonts w:ascii="Arial" w:hAnsi="Arial"/>
         <w:sz w:val="24"/>
         <w:szCs w:val="24"/>
         <w:lang w:val="de-DE" w:eastAsia="en-US" w:bidi="ar-SA"/>
@@ -31379,7 +31619,7 @@
       <w:jc w:val="left"/>
     </w:pPr>
     <w:rPr>
-      <w:rFonts w:ascii="Cambria" w:hAnsi="Cambria" w:eastAsia="Cambria" w:cs="" w:asciiTheme="minorHAnsi" w:cstheme="minorBidi" w:eastAsiaTheme="minorHAnsi" w:hAnsiTheme="minorHAnsi"/>
+      <w:rFonts w:ascii="Arial" w:hAnsi="Arial"/>
       <w:color w:val="auto"/>
       <w:kern w:val="0"/>
       <w:sz w:val="24"/>
@@ -31400,7 +31640,7 @@
       <w:outlineLvl w:val="0"/>
     </w:pPr>
     <w:rPr>
-      <w:rFonts w:ascii="Calibri" w:hAnsi="Calibri" w:eastAsia="" w:cs="" w:asciiTheme="majorHAnsi" w:cstheme="majorBidi" w:eastAsiaTheme="majorEastAsia" w:hAnsiTheme="majorHAnsi"/>
+      <w:rFonts w:ascii="Arial" w:hAnsi="Arial"/>
       <w:b/>
       <w:bCs/>
       <w:color w:themeColor="accent1" w:val="4F81BD"/>
@@ -31422,7 +31662,7 @@
       <w:outlineLvl w:val="1"/>
     </w:pPr>
     <w:rPr>
-      <w:rFonts w:ascii="Calibri" w:hAnsi="Calibri" w:eastAsia="" w:cs="" w:asciiTheme="majorHAnsi" w:cstheme="majorBidi" w:eastAsiaTheme="majorEastAsia" w:hAnsiTheme="majorHAnsi"/>
+      <w:rFonts w:ascii="Arial" w:hAnsi="Arial"/>
       <w:b/>
       <w:bCs/>
       <w:color w:themeColor="accent1" w:val="4F81BD"/>
@@ -31444,7 +31684,7 @@
       <w:outlineLvl w:val="2"/>
     </w:pPr>
     <w:rPr>
-      <w:rFonts w:ascii="Calibri" w:hAnsi="Calibri" w:eastAsia="" w:cs="" w:asciiTheme="majorHAnsi" w:cstheme="majorBidi" w:eastAsiaTheme="majorEastAsia" w:hAnsiTheme="majorHAnsi"/>
+      <w:rFonts w:ascii="Arial" w:hAnsi="Arial"/>
       <w:b/>
       <w:bCs/>
       <w:color w:themeColor="accent1" w:val="4F81BD"/>
@@ -31466,7 +31706,7 @@
       <w:outlineLvl w:val="3"/>
     </w:pPr>
     <w:rPr>
-      <w:rFonts w:ascii="Calibri" w:hAnsi="Calibri" w:eastAsia="" w:cs="" w:asciiTheme="majorHAnsi" w:cstheme="majorBidi" w:eastAsiaTheme="majorEastAsia" w:hAnsiTheme="majorHAnsi"/>
+      <w:rFonts w:ascii="Arial" w:hAnsi="Arial"/>
       <w:bCs/>
       <w:i/>
       <w:color w:themeColor="accent1" w:val="4F81BD"/>
@@ -31488,7 +31728,7 @@
       <w:outlineLvl w:val="4"/>
     </w:pPr>
     <w:rPr>
-      <w:rFonts w:ascii="Calibri" w:hAnsi="Calibri" w:eastAsia="" w:cs="" w:asciiTheme="majorHAnsi" w:cstheme="majorBidi" w:eastAsiaTheme="majorEastAsia" w:hAnsiTheme="majorHAnsi"/>
+      <w:rFonts w:ascii="Arial" w:hAnsi="Arial"/>
       <w:iCs/>
       <w:color w:themeColor="accent1" w:val="4F81BD"/>
       <w:sz w:val="24"/>
@@ -31509,7 +31749,7 @@
       <w:outlineLvl w:val="5"/>
     </w:pPr>
     <w:rPr>
-      <w:rFonts w:ascii="Calibri" w:hAnsi="Calibri" w:eastAsia="" w:cs="" w:asciiTheme="majorHAnsi" w:cstheme="majorBidi" w:eastAsiaTheme="majorEastAsia" w:hAnsiTheme="majorHAnsi"/>
+      <w:rFonts w:ascii="Arial" w:hAnsi="Arial"/>
       <w:color w:themeColor="accent1" w:val="4F81BD"/>
       <w:sz w:val="24"/>
       <w:szCs w:val="24"/>
@@ -31529,7 +31769,7 @@
       <w:outlineLvl w:val="6"/>
     </w:pPr>
     <w:rPr>
-      <w:rFonts w:ascii="Calibri" w:hAnsi="Calibri" w:eastAsia="" w:cs="" w:asciiTheme="majorHAnsi" w:cstheme="majorBidi" w:eastAsiaTheme="majorEastAsia" w:hAnsiTheme="majorHAnsi"/>
+      <w:rFonts w:ascii="Arial" w:hAnsi="Arial"/>
       <w:color w:themeColor="accent1" w:val="4F81BD"/>
       <w:sz w:val="24"/>
       <w:szCs w:val="24"/>
@@ -31549,7 +31789,7 @@
       <w:outlineLvl w:val="7"/>
     </w:pPr>
     <w:rPr>
-      <w:rFonts w:ascii="Calibri" w:hAnsi="Calibri" w:eastAsia="" w:cs="" w:asciiTheme="majorHAnsi" w:cstheme="majorBidi" w:eastAsiaTheme="majorEastAsia" w:hAnsiTheme="majorHAnsi"/>
+      <w:rFonts w:ascii="Arial" w:hAnsi="Arial"/>
       <w:color w:themeColor="accent1" w:val="4F81BD"/>
       <w:sz w:val="24"/>
       <w:szCs w:val="24"/>
@@ -31569,7 +31809,7 @@
       <w:outlineLvl w:val="8"/>
     </w:pPr>
     <w:rPr>
-      <w:rFonts w:ascii="Calibri" w:hAnsi="Calibri" w:eastAsia="" w:cs="" w:asciiTheme="majorHAnsi" w:cstheme="majorBidi" w:eastAsiaTheme="majorEastAsia" w:hAnsiTheme="majorHAnsi"/>
+      <w:rFonts w:ascii="Arial" w:hAnsi="Arial"/>
       <w:color w:themeColor="accent1" w:val="4F81BD"/>
       <w:sz w:val="24"/>
       <w:szCs w:val="24"/>
@@ -31918,7 +32158,7 @@
       <w:spacing w:before="240" w:after="120"/>
     </w:pPr>
     <w:rPr>
-      <w:rFonts w:ascii="Liberation Sans" w:hAnsi="Liberation Sans" w:eastAsia="DejaVu Sans" w:cs="DejaVu Sans"/>
+      <w:rFonts w:ascii="Arial" w:hAnsi="Arial"/>
       <w:sz w:val="28"/>
       <w:szCs w:val="28"/>
     </w:rPr>
@@ -31989,7 +32229,7 @@
       <w:jc w:val="center"/>
     </w:pPr>
     <w:rPr>
-      <w:rFonts w:ascii="Calibri" w:hAnsi="Calibri" w:eastAsia="" w:cs="" w:asciiTheme="majorHAnsi" w:cstheme="majorBidi" w:eastAsiaTheme="majorEastAsia" w:hAnsiTheme="majorHAnsi"/>
+      <w:rFonts w:ascii="Arial" w:hAnsi="Arial"/>
       <w:b/>
       <w:bCs/>
       <w:color w:themeColor="accent1" w:themeShade="b5" w:val="345A8A"/>
@@ -32026,7 +32266,7 @@
       <w:jc w:val="center"/>
     </w:pPr>
     <w:rPr>
-      <w:rFonts w:ascii="Cambria" w:hAnsi="Cambria" w:eastAsia="Cambria" w:cs="" w:asciiTheme="minorHAnsi" w:cstheme="minorBidi" w:eastAsiaTheme="minorHAnsi" w:hAnsiTheme="minorHAnsi"/>
+      <w:rFonts w:ascii="Arial" w:hAnsi="Arial"/>
       <w:color w:val="auto"/>
       <w:kern w:val="0"/>
       <w:sz w:val="24"/>
@@ -32047,7 +32287,7 @@
       <w:jc w:val="center"/>
     </w:pPr>
     <w:rPr>
-      <w:rFonts w:ascii="Cambria" w:hAnsi="Cambria" w:eastAsia="Cambria" w:cs="" w:asciiTheme="minorHAnsi" w:cstheme="minorBidi" w:eastAsiaTheme="minorHAnsi" w:hAnsiTheme="minorHAnsi"/>
+      <w:rFonts w:ascii="Arial" w:hAnsi="Arial"/>
       <w:color w:val="auto"/>
       <w:kern w:val="0"/>
       <w:sz w:val="24"/>
@@ -32170,7 +32410,7 @@
       <w:outlineLvl w:val="9"/>
     </w:pPr>
     <w:rPr>
-      <w:rFonts w:ascii="Calibri" w:hAnsi="Calibri" w:eastAsia="" w:cs="" w:asciiTheme="majorHAnsi" w:cstheme="majorBidi" w:eastAsiaTheme="majorEastAsia" w:hAnsiTheme="majorHAnsi"/>
+      <w:rFonts w:ascii="Arial" w:hAnsi="Arial"/>
       <w:b w:val="false"/>
       <w:bCs w:val="false"/>
       <w:color w:themeColor="accent1" w:themeShade="bf" w:val="365F91"/>

</xml_diff>

<commit_message>
docs: Layer -> Schicht global ersetzt, OS-Rebuild-Formulierungen korrigiert
- 'Layer' durchgaengig durch 'Schicht' ersetzt (MD, DOCX, PPTX alle Slides)
- 'ohne OS-Rebuild' Formulierungen korrigiert: Packer baut immer die
  vollstaendige Pipeline -- der Wert liegt im unabhaengigen Wechseln der
  Schicht-Scripts, nicht im Ueberspringen des Builds
- DEX-Austauschbarkeit: 'Agent austauschbar ohne OS-Rebuild' -> korrekte
  Formulierung (nur Manifest-Eintrag aendern, andere Schichten unberuehrt)

Co-Authored-By: Claude Sonnet 4.6 <noreply@anthropic.com>
</commit_message>
<xml_diff>
--- a/VID-Architekturkonzept-v1.2.docx
+++ b/VID-Architekturkonzept-v1.2.docx
@@ -65,7 +65,7 @@
       </w:pPr>
       <w:r>
         <w:rPr/>
-        <w:t>Das Schichtenmodell umfasst acht klar definierte Ebenen: von der physischen Hardware über den Hypervisor und dessen Steuerungsschicht, die Verzeichnisdienste, das Gast-Betriebssystem, die Treiberschicht und die Applikationen bis hin zum DEX/Monitoring-Layer. Jede Schicht kann durch eine Alternative ersetzt werden, ohne die darüber- oder darunterliegende Schicht neu konfigurieren zu müssen.</w:t>
+        <w:t>Das Schichtenmodell umfasst acht klar definierte Ebenen: von der physischen Hardware über den Hypervisor und dessen Steuerungsschicht, die Verzeichnisdienste, das Gast-Betriebssystem, die Treiberschicht und die Applikationen bis hin zum DEX/Monitoring-Schicht. Jede Schicht kann durch eine Alternative ersetzt werden, ohne die darüber- oder darunterliegende Schicht neu konfigurieren zu müssen.</w:t>
       </w:r>
     </w:p>
     <w:p>
@@ -2423,7 +2423,7 @@
       </w:pPr>
       <w:r>
         <w:rPr/>
-        <w:t>Dadurch kann dasselbe Layer-5-Image als Basis für VMware- und XenServer-Deployments sowie für verschiedene Broker-Plattformen (Citrix, AVD, Horizon) genutzt werden. Nur der Packer-Builder-Typ (Schicht 6) und die VDA-Installation (Schicht 7) unterscheiden sich.</w:t>
+        <w:t>Dadurch kann dasselbe Schicht 5-Image als Basis für VMware- und XenServer-Deployments sowie für verschiedene Broker-Plattformen (Citrix, AVD, Horizon) genutzt werden. Nur der Packer-Builder-Typ (Schicht 6) und die VDA-Installation (Schicht 7) unterscheiden sich.</w:t>
       </w:r>
     </w:p>
     <w:p>
@@ -2434,7 +2434,7 @@
       <w:bookmarkStart w:id="10" w:name="Xecff3202e24ba70c6135a77039f29cb7cc19a59"/>
       <w:r>
         <w:rPr/>
-        <w:t>3.2 Packer Build-Schritte Layer 5 (Golden Image)</w:t>
+        <w:t>3.2 Packer Build-Schritte Schicht 5 (Golden Image)</w:t>
       </w:r>
       <w:bookmarkEnd w:id="10"/>
     </w:p>
@@ -2461,7 +2461,7 @@
         <w:rPr>
           <w:b/>
         </w:rPr>
-        <w:t>Schritt 1 – Installation [Layer 5]:</w:t>
+        <w:t>Schritt 1 – Installation [Schicht 5]:</w:t>
       </w:r>
       <w:r>
         <w:rPr/>
@@ -2481,7 +2481,7 @@
         <w:rPr>
           <w:b/>
         </w:rPr>
-        <w:t>Schritt 2 – OS Baseline [Layer 5]:</w:t>
+        <w:t>Schritt 2 – OS Baseline [Schicht 5]:</w:t>
       </w:r>
       <w:r>
         <w:rPr/>
@@ -2501,7 +2501,7 @@
         <w:rPr>
           <w:b/>
         </w:rPr>
-        <w:t>Schritt 3 – Windows Updates [Layer 5]:</w:t>
+        <w:t>Schritt 3 – Windows Updates [Schicht 5]:</w:t>
       </w:r>
       <w:r>
         <w:rPr/>
@@ -2521,7 +2521,7 @@
         <w:rPr>
           <w:b/>
         </w:rPr>
-        <w:t>Schritt 4 – Export [Layer 5]:</w:t>
+        <w:t>Schritt 4 – Export [Schicht 5]:</w:t>
       </w:r>
       <w:r>
         <w:rPr/>
@@ -2541,7 +2541,7 @@
       </w:r>
       <w:r>
         <w:rPr/>
-        <w:t xml:space="preserve"> Das Layer-5-Image enthält keinen VDA, keinen Broker-Agenten und keine anwendungsspezifischen Konfigurationen. Es ist das austauschbare Fundament für alle darüber liegenden Schichten.</w:t>
+        <w:t xml:space="preserve"> Das Schicht 5-Image enthält keinen VDA, keinen Broker-Agenten und keine anwendungsspezifischen Konfigurationen. Es ist das austauschbare Fundament für alle darüber liegenden Schichten.</w:t>
       </w:r>
     </w:p>
     <w:p>
@@ -2551,7 +2551,7 @@
       </w:pPr>
       <w:r>
         <w:rPr/>
-        <w:t>Die VDA-Installation und alle weiteren Layer-7-Schritte sind in Kapitel 5 (Schicht 7) beschrieben.</w:t>
+        <w:t>Die VDA-Installation und alle weiteren Schicht 7-Schritte sind in Kapitel 5 (Schicht 7) beschrieben.</w:t>
       </w:r>
     </w:p>
     <w:p>
@@ -3254,7 +3254,7 @@
         <w:rPr>
           <w:rStyle w:val="VerbatimChar"/>
         </w:rPr>
-        <w:t xml:space="preserve">  │   ├── vda\                    ← VDA-Installer (Layer 7a)  ← AKTIV</w:t>
+        <w:t xml:space="preserve">  │   ├── vda\                    ← VDA-Installer (Schicht 7a)  ← AKTIV</w:t>
       </w:r>
       <w:r>
         <w:rPr/>
@@ -3334,7 +3334,7 @@
         <w:rPr>
           <w:rStyle w:val="VerbatimChar"/>
         </w:rPr>
-        <w:t xml:space="preserve">  │   ├── controlup\              ← ControlUp Agent (Layer 8, später)</w:t>
+        <w:t xml:space="preserve">  │   ├── controlup\              ← ControlUp Agent (Schicht 8, später)</w:t>
       </w:r>
       <w:r>
         <w:rPr/>
@@ -3344,7 +3344,7 @@
         <w:rPr>
           <w:rStyle w:val="VerbatimChar"/>
         </w:rPr>
-        <w:t xml:space="preserve">  │   └── uberagent\              ← uberagent (Layer 8, später)</w:t>
+        <w:t xml:space="preserve">  │   └── uberagent\              ← uberagent (Schicht 8, später)</w:t>
       </w:r>
       <w:r>
         <w:rPr/>
@@ -3384,7 +3384,7 @@
         <w:rPr>
           <w:rStyle w:val="VerbatimChar"/>
         </w:rPr>
-        <w:t xml:space="preserve">  └── apps\                       ← Business App Installer (Layer 7c)</w:t>
+        <w:t xml:space="preserve">  └── apps\                       ← Business App Installer (Schicht 7c)</w:t>
       </w:r>
     </w:p>
     <w:p>
@@ -4113,7 +4113,7 @@
       </w:r>
       <w:r>
         <w:rPr/>
-        <w:t xml:space="preserve"> aktualisiert werden – ohne OS-Image-Rebuild.</w:t>
+        <w:t xml:space="preserve"> aktualisiert werden — ein erneuter Packer-Build baut das aktualisierte Image dann vollautomatisch.</w:t>
       </w:r>
     </w:p>
     <w:p>
@@ -4834,7 +4834,7 @@
       <w:bookmarkStart w:id="17" w:name="abhängigkeit-layer-6-layer-7"/>
       <w:r>
         <w:rPr/>
-        <w:t>4.4 Abhängigkeit Layer 6 → Layer 7</w:t>
+        <w:t>4.4 Abhängigkeit Schicht 6 → Schicht 7</w:t>
       </w:r>
       <w:bookmarkEnd w:id="17"/>
     </w:p>
@@ -4855,7 +4855,7 @@
       </w:pPr>
       <w:r>
         <w:rPr/>
-        <w:t>Das Layer-5-Image (reines OS) bleibt dabei vollständig frei von VDA-Komponenten. Der VDA wird erst im Layer-7-Build-Schritt auf das fertige Layer-5+6-Image aufgebracht.</w:t>
+        <w:t>Das Schicht 5-Image (reines OS) bleibt dabei vollständig frei von VDA-Komponenten. Der VDA wird erst im Schicht 7-Build-Schritt auf das fertige Schicht 5+6-Image aufgebracht.</w:t>
       </w:r>
     </w:p>
     <w:p>
@@ -4893,7 +4893,7 @@
       </w:pPr>
       <w:r>
         <w:rPr/>
-        <w:t>Schicht 7 umfasst den Broker-Agenten (VDA), das Profil-Management und alle Business-Anwendungen. Sie wird auf das fertige Layer-5+6-Image aufgebracht und ist vollständig austauschbar ohne OS-Rebuild.</w:t>
+        <w:t>Schicht 7 umfasst den Broker-Agenten (VDA), das Profil-Management und alle Business-Anwendungen. Sie wird auf das fertige Schicht 5+6-Image aufgebracht und ist vollständig austauschbar — ein Schicht-7-Wechsel erfordert nur eine Änderung des Schicht-7-Scripts, kein Eingriff in Schicht-5- oder Schicht-6-Scripts.</w:t>
       </w:r>
     </w:p>
     <w:p>
@@ -4904,7 +4904,7 @@
       <w:bookmarkStart w:id="19" w:name="X064201adb6c3aed4ad82610a3c06f5735c78b74"/>
       <w:r>
         <w:rPr/>
-        <w:t>5.0 Packer Build-Schritte Layer 7 (Customization)</w:t>
+        <w:t>5.0 Packer Build-Schritte Schicht 7 (Customization)</w:t>
       </w:r>
       <w:bookmarkEnd w:id="19"/>
     </w:p>
@@ -4915,7 +4915,7 @@
       </w:pPr>
       <w:r>
         <w:rPr/>
-        <w:t>Diese Schritte werden nach den Layer-5-Schritten (Kapitel 3.2) im selben Packer-Lauf ausgeführt. Sie setzen ein vollständig gepatchtes Layer-5-Image mit installierten Layer-6-Treibern voraus.</w:t>
+        <w:t>Diese Schritte werden nach den Schicht 5-Schritten (Kapitel 3.2) im selben Packer-Lauf ausgeführt. Sie setzen ein vollständig gepatchtes Schicht 5-Image mit installierten Schicht 6-Treibern voraus.</w:t>
       </w:r>
     </w:p>
     <w:p>
@@ -4931,7 +4931,7 @@
         <w:rPr>
           <w:b/>
         </w:rPr>
-        <w:t>Schritt 5 – Citrix VDA [Layer 7a – Broker Agent]:</w:t>
+        <w:t>Schritt 5 – Citrix VDA [Schicht 7a – Broker Agent]:</w:t>
       </w:r>
       <w:r>
         <w:rPr/>
@@ -4961,7 +4961,7 @@
         <w:rPr>
           <w:b/>
         </w:rPr>
-        <w:t>Schritt 6 – Neustart [Layer 7a]:</w:t>
+        <w:t>Schritt 6 – Neustart [Schicht 7a]:</w:t>
       </w:r>
       <w:r>
         <w:rPr/>
@@ -4981,7 +4981,7 @@
         <w:rPr>
           <w:b/>
         </w:rPr>
-        <w:t>Schritt 7 – Post-VDA Updates [Layer 7a]:</w:t>
+        <w:t>Schritt 7 – Post-VDA Updates [Schicht 7a]:</w:t>
       </w:r>
       <w:r>
         <w:rPr/>
@@ -5001,7 +5001,7 @@
         <w:rPr>
           <w:b/>
         </w:rPr>
-        <w:t>Schritt 8 – Optimierungen [Layer 7a+7b]:</w:t>
+        <w:t>Schritt 8 – Optimierungen [Schicht 7a+7b]:</w:t>
       </w:r>
       <w:r>
         <w:rPr/>
@@ -5021,7 +5021,7 @@
         <w:rPr>
           <w:b/>
         </w:rPr>
-        <w:t>Schritt 9 – MCS Prep [Layer 7]:</w:t>
+        <w:t>Schritt 9 – MCS Prep [Schicht 7]:</w:t>
       </w:r>
       <w:r>
         <w:rPr/>
@@ -5041,7 +5041,7 @@
         <w:rPr>
           <w:b/>
         </w:rPr>
-        <w:t>Schritt 10 – Export [Layer 7]:</w:t>
+        <w:t>Schritt 10 – Export [Schicht 7]:</w:t>
       </w:r>
       <w:r>
         <w:rPr/>
@@ -5061,7 +5061,7 @@
       </w:r>
       <w:r>
         <w:rPr/>
-        <w:t xml:space="preserve"> Layer 5 und Layer 7 sind konzeptionell getrennte Build-Phasen – auch wenn sie im gleichen Packer-Lauf ausgeführt werden. In einer späteren Ausbaustufe können beide Phasen in separate Packer-Builds aufgeteilt werden, sodass das Layer-5-Image als universelle Basis für mehrere Layer-7-Varianten dient.</w:t>
+        <w:t xml:space="preserve"> Schicht 5 und Schicht 7 sind konzeptionell getrennte Build-Phasen – auch wenn sie im gleichen Packer-Lauf ausgeführt werden. In einer späteren Ausbaustufe können beide Phasen in separate Packer-Builds aufgeteilt werden, sodass das Schicht 5-Image als universelle Basis für mehrere Schicht 7-Varianten dient.</w:t>
       </w:r>
     </w:p>
     <w:p>
@@ -7952,7 +7952,7 @@
       </w:pPr>
       <w:r>
         <w:rPr/>
-        <w:t xml:space="preserve">Schicht 8 erfasst die Benutzererfahrung (Digital Employee Experience, DEX) und die Infrastrukturüberwachung vollständig unabhängig von den darunterliegenden Schichten. DEX-Agenten werden im Master Image installiert (via Packer, Layer 8-Schritt), jedoch </w:t>
+        <w:t xml:space="preserve">Schicht 8 erfasst die Benutzererfahrung (Digital Employee Experience, DEX) und die Infrastrukturüberwachung vollständig unabhängig von den darunterliegenden Schichten. DEX-Agenten werden im Master Image installiert (via Packer, Schicht 8-Schritt), jedoch </w:t>
       </w:r>
       <w:r>
         <w:rPr>
@@ -8002,7 +8002,7 @@
       </w:pPr>
       <w:r>
         <w:rPr/>
-        <w:t>Sie können ohne OS-Rebuild oder VDA-Neuinstallation ausgetauscht werden (ControlUp → uberagent → Nexthink)</w:t>
+        <w:t>Ein Wechsel des DEX-Tools (z.B. ControlUp → uberagent → Nexthink) erfordert nur eine Änderung im Apps-Manifest — kein Eingriff in Schicht-5-, Schicht-6- oder Schicht-7-Scripts. Packer führt dann den vollständigen Build mit dem neuen DEX-Agenten durch.</w:t>
       </w:r>
     </w:p>
     <w:p>
@@ -8192,7 +8192,7 @@
                 <w:szCs w:val="24"/>
                 <w:lang w:val="de-DE" w:eastAsia="en-US" w:bidi="ar-SA"/>
               </w:rPr>
-              <w:t>VID-Layer</w:t>
+              <w:t>VID-Schicht</w:t>
             </w:r>
           </w:p>
         </w:tc>
@@ -8288,7 +8288,7 @@
                 <w:szCs w:val="24"/>
                 <w:lang w:val="de-DE" w:eastAsia="en-US" w:bidi="ar-SA"/>
               </w:rPr>
-              <w:t>Layer 8 (Image)</w:t>
+              <w:t>Schicht 8 (Image)</w:t>
             </w:r>
           </w:p>
         </w:tc>
@@ -8384,7 +8384,7 @@
                 <w:szCs w:val="24"/>
                 <w:lang w:val="de-DE" w:eastAsia="en-US" w:bidi="ar-SA"/>
               </w:rPr>
-              <w:t>Layer 3 (Infra)</w:t>
+              <w:t>Schicht 3 (Infra)</w:t>
             </w:r>
           </w:p>
         </w:tc>
@@ -8480,7 +8480,7 @@
                 <w:szCs w:val="24"/>
                 <w:lang w:val="de-DE" w:eastAsia="en-US" w:bidi="ar-SA"/>
               </w:rPr>
-              <w:t>Layer 3 (Infra)</w:t>
+              <w:t>Schicht 3 (Infra)</w:t>
             </w:r>
           </w:p>
         </w:tc>
@@ -8576,7 +8576,7 @@
                 <w:szCs w:val="24"/>
                 <w:lang w:val="de-DE" w:eastAsia="en-US" w:bidi="ar-SA"/>
               </w:rPr>
-              <w:t>Layer 3 (Infra)</w:t>
+              <w:t>Schicht 3 (Infra)</w:t>
             </w:r>
           </w:p>
         </w:tc>
@@ -8672,7 +8672,7 @@
                 <w:szCs w:val="24"/>
                 <w:lang w:val="de-DE" w:eastAsia="en-US" w:bidi="ar-SA"/>
               </w:rPr>
-              <w:t>Layer 8</w:t>
+              <w:t>Schicht 8</w:t>
             </w:r>
           </w:p>
         </w:tc>
@@ -8984,7 +8984,7 @@
                 <w:szCs w:val="24"/>
                 <w:lang w:val="de-DE" w:eastAsia="en-US" w:bidi="ar-SA"/>
               </w:rPr>
-              <w:t>VID-Layer</w:t>
+              <w:t>VID-Schicht</w:t>
             </w:r>
           </w:p>
         </w:tc>
@@ -10371,38 +10371,38 @@
                 <w:szCs w:val="24"/>
                 <w:lang w:val="de-DE" w:eastAsia="en-US" w:bidi="ar-SA"/>
               </w:rPr>
-              <w:t>Hoch (Agent austauschbar ohne OS-Rebuild)</w:t>
-            </w:r>
-          </w:p>
-        </w:tc>
-        <w:tc>
-          <w:tcPr>
-            <w:tcW w:w="3120" w:type="dxa"/>
-            <w:tcBorders/>
-          </w:tcPr>
-          <w:p>
-            <w:pPr>
-              <w:pStyle w:val="Compact"/>
-              <w:widowControl/>
-              <w:spacing w:before="36" w:after="36"/>
-              <w:jc w:val="left"/>
-              <w:rPr>
-                <w:rFonts w:ascii="Cambria" w:hAnsi="Cambria" w:eastAsia="Cambria" w:cs=""/>
-                <w:kern w:val="0"/>
-                <w:sz w:val="24"/>
-                <w:szCs w:val="24"/>
-                <w:lang w:val="de-DE" w:eastAsia="en-US" w:bidi="ar-SA"/>
-              </w:rPr>
-            </w:pPr>
-            <w:r>
-              <w:rPr>
-                <w:rFonts w:eastAsia="Cambria" w:cs=""/>
-                <w:kern w:val="0"/>
-                <w:sz w:val="24"/>
-                <w:szCs w:val="24"/>
-                <w:lang w:val="de-DE" w:eastAsia="en-US" w:bidi="ar-SA"/>
-              </w:rPr>
-              <w:t>Hoch (Agent austauschbar ohne OS-Rebuild)</w:t>
+              <w:t>Hoch (nur Manifest-Eintrag ändern — andere Schicht-Scripts bleiben unberührt)</w:t>
+            </w:r>
+          </w:p>
+        </w:tc>
+        <w:tc>
+          <w:tcPr>
+            <w:tcW w:w="3120" w:type="dxa"/>
+            <w:tcBorders/>
+          </w:tcPr>
+          <w:p>
+            <w:pPr>
+              <w:pStyle w:val="Compact"/>
+              <w:widowControl/>
+              <w:spacing w:before="36" w:after="36"/>
+              <w:jc w:val="left"/>
+              <w:rPr>
+                <w:rFonts w:ascii="Cambria" w:hAnsi="Cambria" w:eastAsia="Cambria" w:cs=""/>
+                <w:kern w:val="0"/>
+                <w:sz w:val="24"/>
+                <w:szCs w:val="24"/>
+                <w:lang w:val="de-DE" w:eastAsia="en-US" w:bidi="ar-SA"/>
+              </w:rPr>
+            </w:pPr>
+            <w:r>
+              <w:rPr>
+                <w:rFonts w:eastAsia="Cambria" w:cs=""/>
+                <w:kern w:val="0"/>
+                <w:sz w:val="24"/>
+                <w:szCs w:val="24"/>
+                <w:lang w:val="de-DE" w:eastAsia="en-US" w:bidi="ar-SA"/>
+              </w:rPr>
+              <w:t>Hoch (nur Manifest-Eintrag ändern — andere Schicht-Scripts bleiben unberührt)</w:t>
             </w:r>
           </w:p>
         </w:tc>
@@ -10518,7 +10518,7 @@
       </w:r>
       <w:r>
         <w:rPr/>
-        <w:t xml:space="preserve"> Beide Tools schließen sich nicht aus. ControlUp für operatives Echtzeit-Monitoring und proaktive Remediation, uberagent für historische Trendanalyse und Security-Visibility. Im VID-Kontext werden beide als Layer-8-Agenten im Image installiert und können unabhängig voneinander aktiviert, deaktiviert oder ersetzt werden.</w:t>
+        <w:t xml:space="preserve"> Beide Tools schließen sich nicht aus. ControlUp für operatives Echtzeit-Monitoring und proaktive Remediation, uberagent für historische Trendanalyse und Security-Visibility. Im VID-Kontext werden beide als Schicht 8-Agenten im Image installiert und können unabhängig voneinander aktiviert, deaktiviert oder ersetzt werden.</w:t>
       </w:r>
     </w:p>
     <w:p>
@@ -10627,7 +10627,7 @@
       <w:bookmarkStart w:id="33" w:name="voraussetzungen-vorher-modell-layer-8"/>
       <w:r>
         <w:rPr/>
-        <w:t>8.5 Voraussetzungen (Vorher-Modell Layer 8)</w:t>
+        <w:t>8.5 Voraussetzungen (Vorher-Modell Schicht 8)</w:t>
       </w:r>
       <w:bookmarkEnd w:id="33"/>
     </w:p>
@@ -12374,7 +12374,7 @@
       </w:r>
       <w:r>
         <w:rPr/>
-        <w:t xml:space="preserve"> Packer baut das Image (Layer 5–7). Terraform verwaltet die Citrix DaaS Infrastruktur (Schicht 3: Maschinenkataloge, Delivery Groups, Policies). Kein Overlap, klare Verantwortlichkeiten.</w:t>
+        <w:t xml:space="preserve"> Packer baut das Image (Schicht 5–7). Terraform verwaltet die Citrix DaaS Infrastruktur (Schicht 3: Maschinenkataloge, Delivery Groups, Policies). Kein Overlap, klare Verantwortlichkeiten.</w:t>
       </w:r>
     </w:p>
     <w:p>
@@ -22377,7 +22377,7 @@
       <w:bookmarkStart w:id="55" w:name="broker-agent-austauschbarkeit-layer-7"/>
       <w:r>
         <w:rPr/>
-        <w:t>12.3 Broker-Agent Austauschbarkeit (Layer 7)</w:t>
+        <w:t>12.3 Broker-Agent Austauschbarkeit (Schicht 7)</w:t>
       </w:r>
       <w:bookmarkEnd w:id="55"/>
     </w:p>
@@ -23094,7 +23094,7 @@
       <w:bookmarkStart w:id="56" w:name="Xbd1e15072800e97742033cf31e1f9002d05d234"/>
       <w:r>
         <w:rPr/>
-        <w:t>12.4 Profil-Management Austauschbarkeit (Layer 7)</w:t>
+        <w:t>12.4 Profil-Management Austauschbarkeit (Schicht 7)</w:t>
       </w:r>
       <w:bookmarkEnd w:id="56"/>
     </w:p>
@@ -23234,7 +23234,7 @@
                 <w:szCs w:val="24"/>
                 <w:lang w:val="de-DE" w:eastAsia="en-US" w:bidi="ar-SA"/>
               </w:rPr>
-              <w:t>Installationsweg (Layer 7)</w:t>
+              <w:t>Installationsweg (Schicht 7)</w:t>
             </w:r>
           </w:p>
         </w:tc>
@@ -23269,7 +23269,7 @@
                 <w:szCs w:val="24"/>
                 <w:lang w:val="de-DE" w:eastAsia="en-US" w:bidi="ar-SA"/>
               </w:rPr>
-              <w:t>Konfiguration (Layer 4)</w:t>
+              <w:t>Konfiguration (Schicht 4)</w:t>
             </w:r>
           </w:p>
         </w:tc>
@@ -23795,7 +23795,7 @@
       <w:bookmarkStart w:id="57" w:name="X9307a8e4ff99874b55081b257674ffd1a8cef23"/>
       <w:r>
         <w:rPr/>
-        <w:t>12.5 Angepasste Packer Build-Pipeline (Layer-Bewusstsein)</w:t>
+        <w:t>12.5 Angepasste Packer Build-Pipeline (Schicht-Bewusstsein)</w:t>
       </w:r>
       <w:bookmarkEnd w:id="57"/>
     </w:p>
@@ -23970,7 +23970,7 @@
                 <w:szCs w:val="24"/>
                 <w:lang w:val="de-DE" w:eastAsia="en-US" w:bidi="ar-SA"/>
               </w:rPr>
-              <w:t>Austauschbar ohne Image-Rebuild</w:t>
+              <w:t>Script wechselbar ohne Eingriff in andere Schichten</w:t>
             </w:r>
           </w:p>
         </w:tc>
@@ -25791,7 +25791,7 @@
       <w:bookmarkStart w:id="63" w:name="zusammenfassung-layer-ownership"/>
       <w:r>
         <w:rPr/>
-        <w:t>13.4 Zusammenfassung: Layer-Ownership</w:t>
+        <w:t>13.4 Zusammenfassung: Schicht-Ownership</w:t>
       </w:r>
       <w:bookmarkEnd w:id="63"/>
     </w:p>

</xml_diff>